<commit_message>
Syncing phaseI with main
</commit_message>
<xml_diff>
--- a/docs/PhaseI.docx
+++ b/docs/PhaseI.docx
@@ -54,7 +54,19 @@
         <w:t xml:space="preserve"> users will use a username and password system, passwords will be securely hashed and stored on the database and for user-safety we will employ password requirements such as requiring a specific length and including various characters from numbers to symbols. We </w:t>
       </w:r>
       <w:r>
-        <w:t>could employ a MFA through possibly Google Authenticator or replace the username password schema with an OAuth system, which would mitigate leaking password hashes.</w:t>
+        <w:t xml:space="preserve">could </w:t>
+      </w:r>
+      <w:r>
+        <w:t>implement</w:t>
+      </w:r>
+      <w:r>
+        <w:t xml:space="preserve"> </w:t>
+      </w:r>
+      <w:r>
+        <w:t>an</w:t>
+      </w:r>
+      <w:r>
+        <w:t xml:space="preserve"> MFA through possibly Google Authenticator or replace the username password schema with an OAuth system, which would mitigate leaking password hashes.</w:t>
       </w:r>
     </w:p>
     <w:p>
@@ -132,24 +144,14 @@
                             <w:r>
                               <w:t xml:space="preserve">Figure </w:t>
                             </w:r>
-                            <w:r>
-                              <w:fldChar w:fldCharType="begin"/>
-                            </w:r>
-                            <w:r>
-                              <w:instrText xml:space="preserve"> SEQ Figure \* ARABIC </w:instrText>
-                            </w:r>
-                            <w:r>
-                              <w:fldChar w:fldCharType="separate"/>
-                            </w:r>
-                            <w:r>
-                              <w:rPr>
-                                <w:noProof/>
-                              </w:rPr>
-                              <w:t>1</w:t>
-                            </w:r>
-                            <w:r>
-                              <w:fldChar w:fldCharType="end"/>
-                            </w:r>
+                            <w:fldSimple w:instr=" SEQ Figure \* ARABIC ">
+                              <w:r>
+                                <w:rPr>
+                                  <w:noProof/>
+                                </w:rPr>
+                                <w:t>1</w:t>
+                              </w:r>
+                            </w:fldSimple>
                             <w:r>
                               <w:t>, Depicts movement rules for moving between adjacent rooms based on a given position, shown by the blue circle.</w:t>
                             </w:r>
@@ -184,24 +186,14 @@
                       <w:r>
                         <w:t xml:space="preserve">Figure </w:t>
                       </w:r>
-                      <w:r>
-                        <w:fldChar w:fldCharType="begin"/>
-                      </w:r>
-                      <w:r>
-                        <w:instrText xml:space="preserve"> SEQ Figure \* ARABIC </w:instrText>
-                      </w:r>
-                      <w:r>
-                        <w:fldChar w:fldCharType="separate"/>
-                      </w:r>
-                      <w:r>
-                        <w:rPr>
-                          <w:noProof/>
-                        </w:rPr>
-                        <w:t>1</w:t>
-                      </w:r>
-                      <w:r>
-                        <w:fldChar w:fldCharType="end"/>
-                      </w:r>
+                      <w:fldSimple w:instr=" SEQ Figure \* ARABIC ">
+                        <w:r>
+                          <w:rPr>
+                            <w:noProof/>
+                          </w:rPr>
+                          <w:t>1</w:t>
+                        </w:r>
+                      </w:fldSimple>
                       <w:r>
                         <w:t>, Depicts movement rules for moving between adjacent rooms based on a given position, shown by the blue circle.</w:t>
                       </w:r>
@@ -215,6 +207,9 @@
         </mc:AlternateContent>
       </w:r>
       <w:r>
+        <w:rPr>
+          <w:noProof/>
+        </w:rPr>
         <w:drawing>
           <wp:anchor distT="0" distB="0" distL="114300" distR="114300" simplePos="0" relativeHeight="251658240" behindDoc="0" locked="0" layoutInCell="1" allowOverlap="1" wp14:anchorId="0717B4A0" wp14:editId="4F4E6C8D">
             <wp:simplePos x="0" y="0"/>
@@ -239,7 +234,7 @@
                     <pic:cNvPicPr/>
                   </pic:nvPicPr>
                   <pic:blipFill>
-                    <a:blip r:embed="rId6">
+                    <a:blip r:embed="rId7">
                       <a:extLst>
                         <a:ext uri="{28A0092B-C50C-407E-A947-70E740481C1C}">
                           <a14:useLocalDpi xmlns:a14="http://schemas.microsoft.com/office/drawing/2010/main" val="0"/>
@@ -288,22 +283,7 @@
         <w:t>Data Protection</w:t>
       </w:r>
       <w:r>
-        <w:t xml:space="preserve"> will be carried out through secure protocols such as HTTPS; HTTP is natively insecure and attackers listening to transmitted packets can intercept and view request information in plain text which violates confidentiality. To have extra security to sniffing the client-side application in the background can hash their password before sending a request, where in the situation HTTPS fails and an attacker can view the contents of a request the password attribute of a login/register payload will be encrypted.</w:t>
-      </w:r>
-      <w:r>
-        <w:t xml:space="preserve"> We will also store hashes in the database </w:t>
-      </w:r>
-      <w:r>
-        <w:t>if</w:t>
-      </w:r>
-      <w:r>
-        <w:t xml:space="preserve"> the database </w:t>
-      </w:r>
-      <w:r>
-        <w:t xml:space="preserve">is </w:t>
-      </w:r>
-      <w:r>
-        <w:t>leaked.</w:t>
+        <w:t xml:space="preserve"> will be carried out through secure protocols such as HTTPS; HTTP is natively insecure and attackers listening to transmitted packets can intercept and view request information in plain text which violates confidentiality.</w:t>
       </w:r>
     </w:p>
     <w:p>
@@ -360,11 +340,20 @@
     <w:p>
       <w:r>
         <w:tab/>
-        <w:t>NGINX natively offers load-balancing which allows the server to handle large amounts of traffic without overwhelming a specific load section. We can configure the database to backup information on a given delay, provided that this class project is not handling critical information we do not need a rigorous backup routine, a daily backup will suffice. In the case of a database leak it really depends on our system we chose when developing; if we use a username and password schema then we will need to provide a special reset link via email to notify about the leak and suggest the user reset their password, or we can do the same email approach but perform a system-wide reset where the backend server sets a random password and we will send this to the user. Both systems run the risk of failing if the attacker has access to their emails. If we use an OAuth system where the users sign-in through services like Google, Microsoft, Discord, etc., this puts less stress on us as we are not storing their credentials, we can simply clear all of the sessions as we would not hold any actual credentials.</w:t>
+        <w:t xml:space="preserve">NGINX natively offers load-balancing which allows the server to handle large amounts of traffic without overwhelming a specific load section. We can configure the database to backup information on a given delay, provided that this class project is not handling critical information we do not need a rigorous backup routine, a daily backup will suffice. In the case of a database leak it really depends on our system we chose when developing; if we use a username and password schema then we will need to provide a special reset link via email to notify about the leak and suggest the user reset their password, or we can do the same email approach but perform a system-wide reset where the backend server sets a random password and we will send this to the user. Both systems run the risk of failing if the attacker has access to their emails. If we use an OAuth system where the users sign-in through services like Google, Microsoft, Discord, etc., this puts less stress on us as we are not storing their credentials, </w:t>
+      </w:r>
+      <w:r>
+        <w:t xml:space="preserve">if a session is </w:t>
+      </w:r>
+      <w:r>
+        <w:t>compromised,</w:t>
+      </w:r>
+      <w:r>
+        <w:t xml:space="preserve"> we can simply delete it from the database.</w:t>
       </w:r>
     </w:p>
     <w:sectPr>
-      <w:headerReference w:type="default" r:id="rId7"/>
+      <w:headerReference w:type="default" r:id="rId8"/>
       <w:pgSz w:w="12240" w:h="15840"/>
       <w:pgMar w:top="1440" w:right="1440" w:bottom="1440" w:left="1440" w:header="720" w:footer="720" w:gutter="0"/>
       <w:cols w:space="720"/>
@@ -449,12 +438,56 @@
   <w:p>
     <w:pPr>
       <w:pStyle w:val="Header"/>
+      <w:jc w:val="both"/>
     </w:pPr>
     <w:r>
       <w:t>Conner Brunner</w:t>
     </w:r>
+    <w:r>
+      <w:tab/>
+    </w:r>
+    <w:r>
+      <w:tab/>
+    </w:r>
+    <w:hyperlink r:id="rId1" w:history="1">
+      <w:r>
+        <w:rPr>
+          <w:rStyle w:val="Hyperlink"/>
+        </w:rPr>
+        <w:t>GitHub Repository</w:t>
+      </w:r>
+    </w:hyperlink>
   </w:p>
 </w:hdr>
+</file>
+
+<file path=word/numbering.xml><?xml version="1.0" encoding="utf-8"?>
+<w:numbering xmlns:wpc="http://schemas.microsoft.com/office/word/2010/wordprocessingCanvas" xmlns:cx="http://schemas.microsoft.com/office/drawing/2014/chartex" xmlns:cx1="http://schemas.microsoft.com/office/drawing/2015/9/8/chartex" xmlns:cx2="http://schemas.microsoft.com/office/drawing/2015/10/21/chartex" xmlns:cx3="http://schemas.microsoft.com/office/drawing/2016/5/9/chartex" xmlns:cx4="http://schemas.microsoft.com/office/drawing/2016/5/10/chartex" xmlns:cx5="http://schemas.microsoft.com/office/drawing/2016/5/11/chartex" xmlns:cx6="http://schemas.microsoft.com/office/drawing/2016/5/12/chartex" xmlns:cx7="http://schemas.microsoft.com/office/drawing/2016/5/13/chartex" xmlns:cx8="http://schemas.microsoft.com/office/drawing/2016/5/14/chartex" xmlns:mc="http://schemas.openxmlformats.org/markup-compatibility/2006" xmlns:aink="http://schemas.microsoft.com/office/drawing/2016/ink" xmlns:am3d="http://schemas.microsoft.com/office/drawing/2017/model3d" xmlns:o="urn:schemas-microsoft-com:office:office" xmlns:oel="http://schemas.microsoft.com/office/2019/extlst" xmlns:r="http://schemas.openxmlformats.org/officeDocument/2006/relationships" xmlns:m="http://schemas.openxmlformats.org/officeDocument/2006/math" xmlns:v="urn:schemas-microsoft-com:vml" xmlns:wp14="http://schemas.microsoft.com/office/word/2010/wordprocessingDrawing" xmlns:wp="http://schemas.openxmlformats.org/drawingml/2006/wordprocessingDrawing" xmlns:w10="urn:schemas-microsoft-com:office:word" xmlns:w="http://schemas.openxmlformats.org/wordprocessingml/2006/main" xmlns:w14="http://schemas.microsoft.com/office/word/2010/wordml" xmlns:w15="http://schemas.microsoft.com/office/word/2012/wordml" xmlns:w16cex="http://schemas.microsoft.com/office/word/2018/wordml/cex" xmlns:w16cid="http://schemas.microsoft.com/office/word/2016/wordml/cid" xmlns:w16="http://schemas.microsoft.com/office/word/2018/wordml" xmlns:w16du="http://schemas.microsoft.com/office/word/2023/wordml/word16du" xmlns:w16sdtdh="http://schemas.microsoft.com/office/word/2020/wordml/sdtdatahash" xmlns:w16sdtfl="http://schemas.microsoft.com/office/word/2024/wordml/sdtformatlock" xmlns:w16se="http://schemas.microsoft.com/office/word/2015/wordml/symex" xmlns:wpg="http://schemas.microsoft.com/office/word/2010/wordprocessingGroup" xmlns:wpi="http://schemas.microsoft.com/office/word/2010/wordprocessingInk" xmlns:wne="http://schemas.microsoft.com/office/word/2006/wordml" xmlns:wps="http://schemas.microsoft.com/office/word/2010/wordprocessingShape" mc:Ignorable="w14 w15 w16se w16cid w16 w16cex w16sdtdh w16sdtfl w16du wp14">
+  <w:abstractNum w:abstractNumId="0" w15:restartNumberingAfterBreak="0">
+    <w:nsid w:val="FFFFFF89"/>
+    <w:multiLevelType w:val="singleLevel"/>
+    <w:tmpl w:val="BE84432C"/>
+    <w:lvl w:ilvl="0">
+      <w:start w:val="1"/>
+      <w:numFmt w:val="bullet"/>
+      <w:pStyle w:val="ListBullet"/>
+      <w:lvlText w:val=""/>
+      <w:lvlJc w:val="left"/>
+      <w:pPr>
+        <w:tabs>
+          <w:tab w:val="num" w:pos="360"/>
+        </w:tabs>
+        <w:ind w:left="360" w:hanging="360"/>
+      </w:pPr>
+      <w:rPr>
+        <w:rFonts w:ascii="Symbol" w:hAnsi="Symbol" w:hint="default"/>
+      </w:rPr>
+    </w:lvl>
+  </w:abstractNum>
+  <w:num w:numId="1" w16cid:durableId="1786197728">
+    <w:abstractNumId w:val="0"/>
+  </w:num>
+</w:numbering>
 </file>
 
 <file path=word/styles.xml><?xml version="1.0" encoding="utf-8"?>
@@ -1437,6 +1470,54 @@
       <w:szCs w:val="18"/>
     </w:rPr>
   </w:style>
+  <w:style w:type="paragraph" w:styleId="ListBullet">
+    <w:name w:val="List Bullet"/>
+    <w:basedOn w:val="Normal"/>
+    <w:uiPriority w:val="99"/>
+    <w:unhideWhenUsed/>
+    <w:rsid w:val="002E783E"/>
+    <w:pPr>
+      <w:numPr>
+        <w:numId w:val="1"/>
+      </w:numPr>
+      <w:contextualSpacing/>
+    </w:pPr>
+  </w:style>
+  <w:style w:type="character" w:styleId="Hyperlink">
+    <w:name w:val="Hyperlink"/>
+    <w:basedOn w:val="DefaultParagraphFont"/>
+    <w:uiPriority w:val="99"/>
+    <w:unhideWhenUsed/>
+    <w:rsid w:val="002E783E"/>
+    <w:rPr>
+      <w:color w:val="467886" w:themeColor="hyperlink"/>
+      <w:u w:val="single"/>
+    </w:rPr>
+  </w:style>
+  <w:style w:type="character" w:styleId="UnresolvedMention">
+    <w:name w:val="Unresolved Mention"/>
+    <w:basedOn w:val="DefaultParagraphFont"/>
+    <w:uiPriority w:val="99"/>
+    <w:semiHidden/>
+    <w:unhideWhenUsed/>
+    <w:rsid w:val="002E783E"/>
+    <w:rPr>
+      <w:color w:val="605E5C"/>
+      <w:shd w:val="clear" w:color="auto" w:fill="E1DFDD"/>
+    </w:rPr>
+  </w:style>
+  <w:style w:type="character" w:styleId="FollowedHyperlink">
+    <w:name w:val="FollowedHyperlink"/>
+    <w:basedOn w:val="DefaultParagraphFont"/>
+    <w:uiPriority w:val="99"/>
+    <w:semiHidden/>
+    <w:unhideWhenUsed/>
+    <w:rsid w:val="002E783E"/>
+    <w:rPr>
+      <w:color w:val="96607D" w:themeColor="followedHyperlink"/>
+      <w:u w:val="single"/>
+    </w:rPr>
+  </w:style>
 </w:styles>
 </file>
 

</xml_diff>